<commit_message>
Revamp as per new req.
</commit_message>
<xml_diff>
--- a/packages/fidelity-lab/fixtures/001-core-headings/.output/document.docx
+++ b/packages/fidelity-lab/fixtures/001-core-headings/.output/document.docx
@@ -5,6 +5,7 @@
     <w:p>
       <w:pPr>
         <w:pStyle w:val="Heading1"/>
+        <w:spacing w:before="240" w:after="120"/>
       </w:pPr>
       <w:r>
         <w:t xml:space="preserve">Heading 1</w:t>
@@ -13,6 +14,7 @@
     <w:p>
       <w:pPr>
         <w:pStyle w:val="Heading2"/>
+        <w:spacing w:before="240" w:after="120"/>
       </w:pPr>
       <w:r>
         <w:t xml:space="preserve">Heading 2</w:t>
@@ -21,6 +23,7 @@
     <w:p>
       <w:pPr>
         <w:pStyle w:val="Heading3"/>
+        <w:spacing w:before="240" w:after="120"/>
       </w:pPr>
       <w:r>
         <w:t xml:space="preserve">Heading 3</w:t>
@@ -29,6 +32,7 @@
     <w:p>
       <w:pPr>
         <w:pStyle w:val="Heading4"/>
+        <w:spacing w:before="240" w:after="120"/>
       </w:pPr>
       <w:r>
         <w:t xml:space="preserve">Heading 4</w:t>
@@ -37,6 +41,7 @@
     <w:p>
       <w:pPr>
         <w:pStyle w:val="Heading5"/>
+        <w:spacing w:before="240" w:after="120"/>
       </w:pPr>
       <w:r>
         <w:t xml:space="preserve">Heading 5</w:t>
@@ -45,13 +50,14 @@
     <w:p>
       <w:pPr>
         <w:pStyle w:val="Heading6"/>
+        <w:spacing w:before="240" w:after="120"/>
       </w:pPr>
       <w:r>
         <w:t xml:space="preserve">Heading 6</w:t>
       </w:r>
     </w:p>
     <w:sectPr>
-      <w:pgSz w:w="11906" w:h="16838" w:orient="portrait"/>
+      <w:pgSz w:w="12240" w:h="15840" w:orient="portrait"/>
       <w:pgMar w:top="1440" w:right="1440" w:bottom="1440" w:left="1440" w:header="708" w:footer="708" w:gutter="0"/>
       <w:pgNumType/>
       <w:docGrid w:linePitch="360"/>
@@ -182,6 +188,174 @@
       <w:numFmt w:val="bullet"/>
       <w:lvlText w:val="●"/>
       <w:lvlJc w:val="left"/>
+      <w:pPr>
+        <w:ind w:left="6480" w:hanging="360"/>
+      </w:pPr>
+    </w:lvl>
+  </w:abstractNum>
+  <w:abstractNum w:abstractNumId="2" w15:restartNumberingAfterBreak="0">
+    <w:multiLevelType w:val="hybridMultilevel"/>
+    <w:lvl w:ilvl="0" w15:tentative="1">
+      <w:start w:val="1"/>
+      <w:numFmt w:val="decimal"/>
+      <w:lvlText w:val="%1."/>
+      <w:lvlJc w:val="start"/>
+      <w:pPr>
+        <w:ind w:left="720" w:hanging="360"/>
+      </w:pPr>
+    </w:lvl>
+    <w:lvl w:ilvl="1" w15:tentative="1">
+      <w:start w:val="1"/>
+      <w:numFmt w:val="decimal"/>
+      <w:lvlText w:val="%2."/>
+      <w:lvlJc w:val="start"/>
+      <w:pPr>
+        <w:ind w:left="1440" w:hanging="360"/>
+      </w:pPr>
+    </w:lvl>
+    <w:lvl w:ilvl="2" w15:tentative="1">
+      <w:start w:val="1"/>
+      <w:numFmt w:val="decimal"/>
+      <w:lvlText w:val="%3."/>
+      <w:lvlJc w:val="start"/>
+      <w:pPr>
+        <w:ind w:left="2160" w:hanging="360"/>
+      </w:pPr>
+    </w:lvl>
+    <w:lvl w:ilvl="3" w15:tentative="1">
+      <w:start w:val="1"/>
+      <w:numFmt w:val="decimal"/>
+      <w:lvlText w:val="%4."/>
+      <w:lvlJc w:val="start"/>
+      <w:pPr>
+        <w:ind w:left="2880" w:hanging="360"/>
+      </w:pPr>
+    </w:lvl>
+    <w:lvl w:ilvl="4" w15:tentative="1">
+      <w:start w:val="1"/>
+      <w:numFmt w:val="decimal"/>
+      <w:lvlText w:val="%5."/>
+      <w:lvlJc w:val="start"/>
+      <w:pPr>
+        <w:ind w:left="3600" w:hanging="360"/>
+      </w:pPr>
+    </w:lvl>
+    <w:lvl w:ilvl="5" w15:tentative="1">
+      <w:start w:val="1"/>
+      <w:numFmt w:val="decimal"/>
+      <w:lvlText w:val="%6."/>
+      <w:lvlJc w:val="start"/>
+      <w:pPr>
+        <w:ind w:left="4320" w:hanging="360"/>
+      </w:pPr>
+    </w:lvl>
+    <w:lvl w:ilvl="6" w15:tentative="1">
+      <w:start w:val="1"/>
+      <w:numFmt w:val="decimal"/>
+      <w:lvlText w:val="%7."/>
+      <w:lvlJc w:val="start"/>
+      <w:pPr>
+        <w:ind w:left="5040" w:hanging="360"/>
+      </w:pPr>
+    </w:lvl>
+    <w:lvl w:ilvl="7" w15:tentative="1">
+      <w:start w:val="1"/>
+      <w:numFmt w:val="decimal"/>
+      <w:lvlText w:val="%8."/>
+      <w:lvlJc w:val="start"/>
+      <w:pPr>
+        <w:ind w:left="5760" w:hanging="360"/>
+      </w:pPr>
+    </w:lvl>
+    <w:lvl w:ilvl="8" w15:tentative="1">
+      <w:start w:val="1"/>
+      <w:numFmt w:val="decimal"/>
+      <w:lvlText w:val="%9."/>
+      <w:lvlJc w:val="start"/>
+      <w:pPr>
+        <w:ind w:left="6480" w:hanging="360"/>
+      </w:pPr>
+    </w:lvl>
+  </w:abstractNum>
+  <w:abstractNum w:abstractNumId="3" w15:restartNumberingAfterBreak="0">
+    <w:multiLevelType w:val="hybridMultilevel"/>
+    <w:lvl w:ilvl="0" w15:tentative="1">
+      <w:start w:val="1"/>
+      <w:numFmt w:val="bullet"/>
+      <w:lvlText w:val="●"/>
+      <w:lvlJc w:val="start"/>
+      <w:pPr>
+        <w:ind w:left="720" w:hanging="360"/>
+      </w:pPr>
+    </w:lvl>
+    <w:lvl w:ilvl="1" w15:tentative="1">
+      <w:start w:val="1"/>
+      <w:numFmt w:val="bullet"/>
+      <w:lvlText w:val="○"/>
+      <w:lvlJc w:val="start"/>
+      <w:pPr>
+        <w:ind w:left="1440" w:hanging="360"/>
+      </w:pPr>
+    </w:lvl>
+    <w:lvl w:ilvl="2" w15:tentative="1">
+      <w:start w:val="1"/>
+      <w:numFmt w:val="bullet"/>
+      <w:lvlText w:val="■"/>
+      <w:lvlJc w:val="start"/>
+      <w:pPr>
+        <w:ind w:left="2160" w:hanging="360"/>
+      </w:pPr>
+    </w:lvl>
+    <w:lvl w:ilvl="3" w15:tentative="1">
+      <w:start w:val="1"/>
+      <w:numFmt w:val="bullet"/>
+      <w:lvlText w:val="●"/>
+      <w:lvlJc w:val="start"/>
+      <w:pPr>
+        <w:ind w:left="2880" w:hanging="360"/>
+      </w:pPr>
+    </w:lvl>
+    <w:lvl w:ilvl="4" w15:tentative="1">
+      <w:start w:val="1"/>
+      <w:numFmt w:val="bullet"/>
+      <w:lvlText w:val="○"/>
+      <w:lvlJc w:val="start"/>
+      <w:pPr>
+        <w:ind w:left="3600" w:hanging="360"/>
+      </w:pPr>
+    </w:lvl>
+    <w:lvl w:ilvl="5" w15:tentative="1">
+      <w:start w:val="1"/>
+      <w:numFmt w:val="bullet"/>
+      <w:lvlText w:val="■"/>
+      <w:lvlJc w:val="start"/>
+      <w:pPr>
+        <w:ind w:left="4320" w:hanging="360"/>
+      </w:pPr>
+    </w:lvl>
+    <w:lvl w:ilvl="6" w15:tentative="1">
+      <w:start w:val="1"/>
+      <w:numFmt w:val="bullet"/>
+      <w:lvlText w:val="●"/>
+      <w:lvlJc w:val="start"/>
+      <w:pPr>
+        <w:ind w:left="5040" w:hanging="360"/>
+      </w:pPr>
+    </w:lvl>
+    <w:lvl w:ilvl="7" w15:tentative="1">
+      <w:start w:val="1"/>
+      <w:numFmt w:val="bullet"/>
+      <w:lvlText w:val="○"/>
+      <w:lvlJc w:val="start"/>
+      <w:pPr>
+        <w:ind w:left="5760" w:hanging="360"/>
+      </w:pPr>
+    </w:lvl>
+    <w:lvl w:ilvl="8" w15:tentative="1">
+      <w:start w:val="1"/>
+      <w:numFmt w:val="bullet"/>
+      <w:lvlText w:val="■"/>
+      <w:lvlJc w:val="start"/>
       <w:pPr>
         <w:ind w:left="6480" w:hanging="360"/>
       </w:pPr>
@@ -336,5 +510,17 @@
       <w:szCs w:val="20"/>
     </w:rPr>
   </w:style>
+  <w:style w:type="paragraph" w:styleId="FolioCodeBlock">
+    <w:name w:val="Folio Code Block"/>
+    <w:basedOn w:val="Normal"/>
+    <w:pPr>
+      <w:spacing w:before="40" w:after="40" w:line="276"/>
+    </w:pPr>
+    <w:rPr>
+      <w:sz w:val="20"/>
+      <w:szCs w:val="20"/>
+      <w:rFonts w:ascii="Consolas" w:cs="Consolas" w:eastAsia="Consolas" w:hAnsi="Consolas"/>
+    </w:rPr>
+  </w:style>
 </w:styles>
 </file>
</xml_diff>

<commit_message>
docs: Rewrite root README to reflect modular architecture and run final E2E tests
</commit_message>
<xml_diff>
--- a/packages/fidelity-lab/fixtures/001-core-headings/.output/document.docx
+++ b/packages/fidelity-lab/fixtures/001-core-headings/.output/document.docx
@@ -5,7 +5,7 @@
     <w:p>
       <w:pPr>
         <w:pStyle w:val="Heading1"/>
-        <w:spacing w:before="240" w:after="120"/>
+        <w:spacing w:before="480" w:after="160"/>
       </w:pPr>
       <w:r>
         <w:t xml:space="preserve">Heading 1</w:t>
@@ -14,7 +14,7 @@
     <w:p>
       <w:pPr>
         <w:pStyle w:val="Heading2"/>
-        <w:spacing w:before="240" w:after="120"/>
+        <w:spacing w:before="480" w:after="160"/>
       </w:pPr>
       <w:r>
         <w:t xml:space="preserve">Heading 2</w:t>
@@ -23,7 +23,7 @@
     <w:p>
       <w:pPr>
         <w:pStyle w:val="Heading3"/>
-        <w:spacing w:before="240" w:after="120"/>
+        <w:spacing w:before="320" w:after="160"/>
       </w:pPr>
       <w:r>
         <w:t xml:space="preserve">Heading 3</w:t>
@@ -32,7 +32,7 @@
     <w:p>
       <w:pPr>
         <w:pStyle w:val="Heading4"/>
-        <w:spacing w:before="240" w:after="120"/>
+        <w:spacing w:before="320" w:after="160"/>
       </w:pPr>
       <w:r>
         <w:t xml:space="preserve">Heading 4</w:t>
@@ -41,7 +41,7 @@
     <w:p>
       <w:pPr>
         <w:pStyle w:val="Heading5"/>
-        <w:spacing w:before="240" w:after="120"/>
+        <w:spacing w:before="320" w:after="160"/>
       </w:pPr>
       <w:r>
         <w:t xml:space="preserve">Heading 5</w:t>
@@ -50,7 +50,7 @@
     <w:p>
       <w:pPr>
         <w:pStyle w:val="Heading6"/>
-        <w:spacing w:before="240" w:after="120"/>
+        <w:spacing w:before="320" w:after="160"/>
       </w:pPr>
       <w:r>
         <w:t xml:space="preserve">Heading 6</w:t>
@@ -373,8 +373,19 @@
 <file path=word/styles.xml><?xml version="1.0" encoding="utf-8"?>
 <w:styles xmlns:mc="http://schemas.openxmlformats.org/markup-compatibility/2006" xmlns:r="http://schemas.openxmlformats.org/officeDocument/2006/relationships" xmlns:w="http://schemas.openxmlformats.org/wordprocessingml/2006/main" xmlns:w14="http://schemas.microsoft.com/office/word/2010/wordml" xmlns:w15="http://schemas.microsoft.com/office/word/2012/wordml" mc:Ignorable="w14 w15">
   <w:docDefaults>
-    <w:rPrDefault/>
-    <w:pPrDefault/>
+    <w:rPrDefault>
+      <w:rPr>
+        <w:color w:val="1A1A1A"/>
+        <w:sz w:val="22"/>
+        <w:szCs w:val="22"/>
+        <w:rFonts w:ascii="Arial" w:cs="Arial" w:eastAsia="Arial" w:hAnsi="Arial"/>
+      </w:rPr>
+    </w:rPrDefault>
+    <w:pPrDefault>
+      <w:pPr>
+        <w:spacing w:line="360"/>
+      </w:pPr>
+    </w:pPrDefault>
   </w:docDefaults>
   <w:style w:type="paragraph" w:styleId="Title">
     <w:name w:val="Title"/>
@@ -522,5 +533,44 @@
       <w:rFonts w:ascii="Consolas" w:cs="Consolas" w:eastAsia="Consolas" w:hAnsi="Consolas"/>
     </w:rPr>
   </w:style>
+  <w:style w:type="paragraph" w:styleId="Heading1">
+    <w:name w:val="Heading 1"/>
+    <w:basedOn w:val="Normal"/>
+    <w:next w:val="Normal"/>
+    <w:qFormat/>
+    <w:rPr>
+      <w:b/>
+      <w:bCs/>
+      <w:sz w:val="48"/>
+      <w:szCs w:val="48"/>
+      <w:rFonts w:ascii="Arial" w:cs="Arial" w:eastAsia="Arial" w:hAnsi="Arial"/>
+    </w:rPr>
+  </w:style>
+  <w:style w:type="paragraph" w:styleId="Heading2">
+    <w:name w:val="Heading 2"/>
+    <w:basedOn w:val="Normal"/>
+    <w:next w:val="Normal"/>
+    <w:qFormat/>
+    <w:rPr>
+      <w:b/>
+      <w:bCs/>
+      <w:sz w:val="36"/>
+      <w:szCs w:val="36"/>
+      <w:rFonts w:ascii="Arial" w:cs="Arial" w:eastAsia="Arial" w:hAnsi="Arial"/>
+    </w:rPr>
+  </w:style>
+  <w:style w:type="paragraph" w:styleId="Heading3">
+    <w:name w:val="Heading 3"/>
+    <w:basedOn w:val="Normal"/>
+    <w:next w:val="Normal"/>
+    <w:qFormat/>
+    <w:rPr>
+      <w:b/>
+      <w:bCs/>
+      <w:sz w:val="28"/>
+      <w:szCs w:val="28"/>
+      <w:rFonts w:ascii="Arial" w:cs="Arial" w:eastAsia="Arial" w:hAnsi="Arial"/>
+    </w:rPr>
+  </w:style>
 </w:styles>
 </file>
</xml_diff>